<commit_message>
ICEEL EL2036: correct the CCS concept ID and leave page room
The CCS XML used 10010405.10010489.10010490; the ACM CCS ID for
Applied computing > Education > E-learning is 10010495 (as used by the
UCT CS EPrints subject index, which files E-learning under 10010495).
Also narrow the PRISMA figure from 12 to 10 cm so the last page of the
10-page limit is nearly empty when rendered with the template's Linux
Libertine fonts, leaving margin for Word's layout.

Co-Authored-By: Claude Opus 5.5 <noreply@anthropic.com>
Claude-Session: https://claude.ai/code/session_01JF828uiGyeimQxSyCjdcgF
</commit_message>
<xml_diff>
--- a/metaanalysis/conference_submissions/iceel/camera_ready/EL2036_Tokiwa_final.docx
+++ b/metaanalysis/conference_submissions/iceel/camera_ready/EL2036_Tokiwa_final.docx
@@ -222,7 +222,7 @@
       <w:r>
         <w:drawing>
           <wp:inline xmlns:a="http://schemas.openxmlformats.org/drawingml/2006/main" xmlns:pic="http://schemas.openxmlformats.org/drawingml/2006/picture">
-            <wp:extent cx="4320000" cy="5391797"/>
+            <wp:extent cx="3600000" cy="4493165"/>
             <wp:docPr id="1" name="Picture 1"/>
             <wp:cNvGraphicFramePr>
               <a:graphicFrameLocks noChangeAspect="1"/>
@@ -243,7 +243,7 @@
                   <pic:spPr>
                     <a:xfrm>
                       <a:off x="0" y="0"/>
-                      <a:ext cx="4320000" cy="5391797"/>
+                      <a:ext cx="3600000" cy="4493165"/>
                     </a:xfrm>
                     <a:prstGeom prst="rect"/>
                   </pic:spPr>

</xml_diff>

<commit_message>
ICEEL EL2036: final check fixes before camera-ready submission
Numbers: re-running run_hofstede_meta.py reproduces every value in
Tables 1-2 and the region contrast, and the Rivers (2021) values match
its Table 3. The Tokiwa (2025) column did not match the source paper:
Agreeableness (.27-.29) and Neuroticism (.24-.29) had come from
single-subject or facet results. Replace them with the all-subject
Spearman rho from Tokiwa (2025, Table 3) (C .34-.35, A .23, N .17) and
state that neither Neuroticism correlation is significant. The Table 4
direction coding, and so the 3-of-5 correspondence, is unchanged.

Format: Title Case title (to match the registration form), comma-
delimited keywords, alphabetical references, and remove three
references that are never cited (Lynn & Martin 1995; McCrae &
Terracciano 2005; Migliore 2011). The paper is now 9 pages.

Co-Authored-By: Claude Opus 5.5 <noreply@anthropic.com>
Claude-Session: https://claude.ai/code/session_01JF828uiGyeimQxSyCjdcgF
</commit_message>
<xml_diff>
--- a/metaanalysis/conference_submissions/iceel/camera_ready/EL2036_Tokiwa_final.docx
+++ b/metaanalysis/conference_submissions/iceel/camera_ready/EL2036_Tokiwa_final.docx
@@ -7,7 +7,7 @@
         <w:pStyle w:val="Titledocument"/>
       </w:pPr>
       <w:r>
-        <w:t>Cultural dimensions in online learning: A Hofstede-moderated within-Asia synthesis of the Big Five and academic achievement, with a focused look at the Japanese context</w:t>
+        <w:t>Cultural Dimensions in Online Learning: A Hofstede-Moderated Within-Asia Synthesis of the Big Five and Academic Achievement, with a Focused Look at the Japanese Context</w:t>
       </w:r>
     </w:p>
     <w:p>
@@ -64,7 +64,7 @@
         <w:t xml:space="preserve">Results. </w:t>
       </w:r>
       <w:r>
-        <w:t xml:space="preserve">The observed signs correspond to the country-level reference for 3 of 5 traits (Conscientiousness+, Extraversion−, Neuroticism+) and differ for Agreeableness and Openness. Neuroticism is positive in both Japan studies (engagement in one, course grade in the other), which contrasts with the null-to-negative pattern in Western meta-analyses (Poropat 2009; Mammadov 2022) and is in line with Japan's very high Uncertainty Avoidance (UAI = 92) and Masculinity (MAS = 95). Because country-level associations do not imply individual-level effects, and the two outcomes differ in construct and metric, this correspondence is a hypothesis rather than replicated evidence about achievement. </w:t>
+        <w:t xml:space="preserve">The observed signs correspond to the country-level reference for 3 of 5 traits (Conscientiousness+, Extraversion−, Neuroticism+) and differ for Agreeableness and Openness. Neuroticism is positive in direction in both Japan studies (engagement in one, course grade in the other), although neither correlation is statistically significant; which contrasts with the null-to-negative pattern in Western meta-analyses (Poropat 2009; Mammadov 2022) and is in line with Japan's very high Uncertainty Avoidance (UAI = 92) and Masculinity (MAS = 95). Because country-level associations do not imply individual-level effects, and the two outcomes differ in construct and metric, this correspondence is a hypothesis rather than replicated evidence about achievement. </w:t>
       </w:r>
       <w:r>
         <w:rPr>
@@ -95,7 +95,7 @@
         <w:pStyle w:val="KeyWords"/>
       </w:pPr>
       <w:r>
-        <w:t>Additional Keywords and Phrases: meta-analysis; Big Five personality traits; online learning; Hofstede cultural dimensions; Japan; cross-cultural psychology</w:t>
+        <w:t>Additional Keywords and Phrases: meta-analysis, Big Five personality traits, online learning, Hofstede cultural dimensions, Japan, cross-cultural psychology</w:t>
       </w:r>
     </w:p>
     <w:p>
@@ -2131,7 +2131,7 @@
               <w:rPr>
                 <w:sz w:val="16"/>
               </w:rPr>
-              <w:t>not in extractable column</w:t>
+              <w:t>≈ 0 (0.00 to +0.10)</w:t>
             </w:r>
           </w:p>
         </w:tc>
@@ -2175,7 +2175,7 @@
               <w:rPr>
                 <w:sz w:val="16"/>
               </w:rPr>
-              <w:t>ρ = +0.30 to +0.35</w:t>
+              <w:t>ρ = +0.34 to +0.35 (tests completed, mastered)</w:t>
             </w:r>
           </w:p>
         </w:tc>
@@ -2219,7 +2219,7 @@
               <w:rPr>
                 <w:sz w:val="16"/>
               </w:rPr>
-              <w:t>mixed (Assertiveness +0.26; Sociability −)</w:t>
+              <w:t>mixed (Assertiveness +0.26; Sociability −0.23)</w:t>
             </w:r>
           </w:p>
         </w:tc>
@@ -2263,7 +2263,7 @@
               <w:rPr>
                 <w:sz w:val="16"/>
               </w:rPr>
-              <w:t>ρ = +0.27 to +0.29 (Lectures Watched)</w:t>
+              <w:t>ρ = +0.23 (lectures watched)</w:t>
             </w:r>
           </w:p>
         </w:tc>
@@ -2307,7 +2307,7 @@
               <w:rPr>
                 <w:sz w:val="16"/>
               </w:rPr>
-              <w:t>ρ = +0.24 to +0.29 (Anxiety subscale)</w:t>
+              <w:t>ρ = +0.17 (lectures watched, n.s.)</w:t>
             </w:r>
           </w:p>
         </w:tc>
@@ -2321,7 +2321,7 @@
               <w:rPr>
                 <w:sz w:val="16"/>
               </w:rPr>
-              <w:t>+0.107</w:t>
+              <w:t>+0.107 (n.s.)</w:t>
             </w:r>
           </w:p>
         </w:tc>
@@ -2332,7 +2332,7 @@
         <w:pStyle w:val="Para"/>
       </w:pPr>
       <w:r>
-        <w:t>A-25 Tokiwa's values are Spearman ρ with StudySapuri engagement and mastery measures (lectures watched, tests completed and mastered; Tokiwa 2025, Table 3 and text). They are learning-behaviour outcomes, not academic achievement, and they did not meet the extraction protocol (Pearson r with achievement); they are shown only as a descriptive comparator. A-31 Rivers's values are Pearson r with course grade and are the only Japanese achievement evidence in the pool.</w:t>
+        <w:t>A-25 Tokiwa's values are Spearman ρ with StudySapuri engagement and mastery measures (lectures watched, tests completed and mastered; all-subject values from Tokiwa 2025, Table 3). They are learning-behaviour outcomes, not academic achievement, and they did not meet the extraction protocol (Pearson r with achievement); they are shown only as a descriptive comparator. A-31 Rivers's values are Pearson r with course grade and are the only Japanese achievement evidence in the pool.</w:t>
       </w:r>
     </w:p>
     <w:p>
@@ -2526,7 +2526,7 @@
               <w:rPr>
                 <w:sz w:val="16"/>
               </w:rPr>
-              <w:t>+ (.30–.35)</w:t>
+              <w:t>+ (.34–.35)</w:t>
             </w:r>
           </w:p>
         </w:tc>
@@ -2698,7 +2698,7 @@
               <w:rPr>
                 <w:sz w:val="16"/>
               </w:rPr>
-              <w:t>+ (.24–.29)</w:t>
+              <w:t>+ (.17, n.s.)</w:t>
             </w:r>
           </w:p>
         </w:tc>
@@ -2712,7 +2712,7 @@
               <w:rPr>
                 <w:sz w:val="16"/>
               </w:rPr>
-              <w:t>+ (.11)</w:t>
+              <w:t>+ (.11, n.s.)</w:t>
             </w:r>
           </w:p>
         </w:tc>
@@ -2784,7 +2784,7 @@
               <w:rPr>
                 <w:sz w:val="16"/>
               </w:rPr>
-              <w:t>+ (.27–.29)</w:t>
+              <w:t>+ (.23)</w:t>
             </w:r>
           </w:p>
         </w:tc>
@@ -2909,7 +2909,7 @@
         <w:pStyle w:val="Para"/>
       </w:pPr>
       <w:r>
-        <w:t>The signs correspond for 3 of 5 traits (C, E, N) and differ for A and O. Neuroticism is the most noticeable case: it is positive in both studies, which contrasts with the null-to-negative N pattern in Western meta-analyses (Poropat 2009; Mammadov 2022), and both of Japan's most extreme dimensions (UAI, MAS) are positively associated with national N means. However, the two positive values come from different constructs (engagement ρ in Tokiwa, course grade r in Rivers), so they do not replicate one achievement effect; only Rivers's r = +0.107 concerns achievement. The A difference (country-level −, observed +) is a reminder that national trait means need not describe within-country trait – outcome correlations.</w:t>
+        <w:t>The signs correspond for 3 of 5 traits (C, E, N) and differ for A and O. Neuroticism is the most noticeable case: it is positive in direction in both studies (ρ = +0.17 and r = +0.107, neither statistically significant), which contrasts with the null-to-negative N pattern in Western meta-analyses (Poropat 2009; Mammadov 2022), and both of Japan's most extreme dimensions (UAI, MAS) are positively associated with national N means. However, the two positive values come from different constructs (engagement ρ in Tokiwa, course grade r in Rivers), so they do not replicate one achievement effect; only Rivers's r = +0.107 concerns achievement. The A difference (country-level −, observed +) is a reminder that national trait means need not describe within-country trait – outcome correlations.</w:t>
       </w:r>
     </w:p>
     <w:p>
@@ -2981,7 +2981,7 @@
         <w:pStyle w:val="PostHeadPara"/>
       </w:pPr>
       <w:r>
-        <w:t>The Neuroticism correspondence in Table 4 is the most interesting cultural observation in this paper, but it supports a hypothesis rather than a finding. It is consistent with Hofstede's (1986) description of strong-UAI societies, in which students are rewarded for structured, accuracy-focused study — behaviour that trait anxiety might sustain. Two gaps prevent a stronger claim. First, the level of analysis differs: the reference correlations are between nations, whereas the observed correlations are between learners within Japan, so using one to explain the other is a cross-level inference. Testing the mechanism would require individual-level cultural measures (for example, personal uncertainty-avoidance orientation) collected together with personality and outcomes. Second, the outcomes differ: engagement in one study and course grade in the other. The Agreeableness difference (country-level −, observed + in both studies) points the same way: population trait levels need not predict individual-level personality – outcome correlations within a particular activity domain.</w:t>
+        <w:t>The Neuroticism correspondence in Table 4 is the most interesting cultural observation in this paper, but it supports a hypothesis rather than a finding: both correlations are small and not statistically significant. It is consistent with Hofstede's (1986) description of strong-UAI societies, in which students are rewarded for structured, accuracy-focused study — behaviour that trait anxiety might sustain. Two gaps prevent a stronger claim. First, the level of analysis differs: the reference correlations are between nations, whereas the observed correlations are between learners within Japan, so using one to explain the other is a cross-level inference. Testing the mechanism would require individual-level cultural measures (for example, personal uncertainty-avoidance orientation) collected together with personality and outcomes. Second, the outcomes differ: engagement in one study and course grade in the other. The Agreeableness difference (country-level −, observed + in both studies) points the same way: population trait levels need not predict individual-level personality – outcome correlations within a particular activity domain.</w:t>
       </w:r>
     </w:p>
     <w:p>
@@ -3069,6 +3069,102 @@
         <w:pStyle w:val="Bibentry"/>
       </w:pPr>
       <w:r>
+        <w:t>Allik, J. and McCrae, R. R. 2004. Toward a geography of personality traits: Patterns of profiles across 36 cultures. Journal of Cross-Cultural Psychology 35, 1 (2004), 13–28. DOI: 10.1177/0022022103260382.</w:t>
+      </w:r>
+    </w:p>
+    <w:p>
+      <w:pPr>
+        <w:pStyle w:val="Bibentry"/>
+      </w:pPr>
+      <w:r>
+        <w:t>Chen, S., Cheung, A. C. K., and Zeng, Z. 2025. Big Five personality traits and university students' academic performance: A meta-analysis. Personality and Individual Differences 240, 113163 (2025). DOI: 10.1016/j.paid.2025.113163.</w:t>
+      </w:r>
+    </w:p>
+    <w:p>
+      <w:pPr>
+        <w:pStyle w:val="Bibentry"/>
+      </w:pPr>
+      <w:r>
+        <w:t>Cheung, F. M., Cheung, S. F., Wada, S., and Zhang, J. 2003. Indigenous measures of personality assessment in Asian countries: A review. Psychological Assessment 15, 3 (2003), 280–289. DOI: 10.1037/1040-3590.15.3.280.</w:t>
+      </w:r>
+    </w:p>
+    <w:p>
+      <w:pPr>
+        <w:pStyle w:val="Bibentry"/>
+      </w:pPr>
+      <w:r>
+        <w:t>Hofstede Insights. 2024. Country comparison tool. Retrieved 2024 from https://www.hofstede-insights.com/.</w:t>
+      </w:r>
+    </w:p>
+    <w:p>
+      <w:pPr>
+        <w:pStyle w:val="Bibentry"/>
+      </w:pPr>
+      <w:r>
+        <w:t>Hofstede, G. 1986. Cultural differences in teaching and learning. International Journal of Intercultural Relations 10, 3 (1986), 301–320. DOI: 10.1016/0147-1767(86)90015-5.</w:t>
+      </w:r>
+    </w:p>
+    <w:p>
+      <w:pPr>
+        <w:pStyle w:val="Bibentry"/>
+      </w:pPr>
+      <w:r>
+        <w:t>Hofstede, G. 2001. Culture's Consequences: Comparing Values, Behaviors, Institutions and Organizations across Nations (2nd. ed.). Sage Publications, Thousand Oaks, CA.</w:t>
+      </w:r>
+    </w:p>
+    <w:p>
+      <w:pPr>
+        <w:pStyle w:val="Bibentry"/>
+      </w:pPr>
+      <w:r>
+        <w:t>Hofstede, G. and McCrae, R. R. 2004. Personality and culture revisited: Linking traits and dimensions of culture. Cross-Cultural Research 38, 1 (2004), 52–88. DOI: 10.1177/1069397103259443.</w:t>
+      </w:r>
+    </w:p>
+    <w:p>
+      <w:pPr>
+        <w:pStyle w:val="Bibentry"/>
+      </w:pPr>
+      <w:r>
+        <w:t>Mammadov, S. 2022. Big Five personality traits and academic performance: A meta-analysis. Journal of Personality 90, 2 (2022), 222–255. DOI: 10.1111/jopy.12663.</w:t>
+      </w:r>
+    </w:p>
+    <w:p>
+      <w:pPr>
+        <w:pStyle w:val="Bibentry"/>
+      </w:pPr>
+      <w:r>
+        <w:t>McSweeney, B. 2002. Hofstede's model of national cultural differences and their consequences: A triumph of faith — a failure of analysis. Human Relations 55, 1 (2002), 89–118. DOI: 10.1177/0018726702551004.</w:t>
+      </w:r>
+    </w:p>
+    <w:p>
+      <w:pPr>
+        <w:pStyle w:val="Bibentry"/>
+      </w:pPr>
+      <w:r>
+        <w:t>Minkov, M. and Hofstede, G. 2014. A replication of Hofstede's uncertainty avoidance dimension across nationally representative samples from Europe. International Journal of Cross-Cultural Management 14, 1 (2014), 7–22. DOI: 10.1177/1470595814521600.</w:t>
+      </w:r>
+    </w:p>
+    <w:p>
+      <w:pPr>
+        <w:pStyle w:val="Bibentry"/>
+      </w:pPr>
+      <w:r>
+        <w:t>Page, M. J., McKenzie, J. E., Bossuyt, P. M., Boutron, I., Hoffmann, T. C., Mulrow, C. D., Shamseer, L., Tetzlaff, J. M., Akl, E. A., Brennan, S. E., et al. 2021. The PRISMA 2020 statement: An updated guideline for reporting systematic reviews. BMJ 372, n71 (2021). DOI: 10.1136/bmj.n71.</w:t>
+      </w:r>
+    </w:p>
+    <w:p>
+      <w:pPr>
+        <w:pStyle w:val="Bibentry"/>
+      </w:pPr>
+      <w:r>
+        <w:t>Poropat, A. E. 2009. A meta-analysis of the five-factor model of personality and academic performance. Psychological Bulletin 135, 2 (2009), 322–338. DOI: 10.1037/a0014996.</w:t>
+      </w:r>
+    </w:p>
+    <w:p>
+      <w:pPr>
+        <w:pStyle w:val="Bibentry"/>
+      </w:pPr>
+      <w:r>
         <w:t>Rivers, D. J. 2021. The role of personality traits and online academic self-efficacy in acceptance, actual use and achievement in Moodle. Education and Information Technologies 26, 4 (2021), 4353–4378. DOI: 10.1007/s10639-021-10478-3.</w:t>
       </w:r>
     </w:p>
@@ -3077,6 +3173,14 @@
         <w:pStyle w:val="Bibentry"/>
       </w:pPr>
       <w:r>
+        <w:t>Schmitt, D. P., Allik, J., McCrae, R. R., and Benet-Martínez, V. 2007. The geographic distribution of Big Five personality traits: Patterns and profiles of human self-description across 56 nations. Journal of Cross-Cultural Psychology 38, 2 (2007), 173–212. DOI: 10.1177/0022022106297299.</w:t>
+      </w:r>
+    </w:p>
+    <w:p>
+      <w:pPr>
+        <w:pStyle w:val="Bibentry"/>
+      </w:pPr>
+      <w:r>
         <w:t>Tokiwa, E. 2025. Who excels in online learning in Japan? Frontiers in Psychology 16, Article 1420996 (2025). DOI: 10.3389/fpsyg.2025.1420996.</w:t>
       </w:r>
     </w:p>
@@ -3085,6 +3189,14 @@
         <w:pStyle w:val="Bibentry"/>
       </w:pPr>
       <w:r>
+        <w:t>Tokiwa, E. 2026. Big Five personality traits and academic achievement in online learning environments: A systematic review and meta-analysis. Research Square preprint (2026). DOI: 10.21203/rs.3.rs-9513298/v1.</w:t>
+      </w:r>
+    </w:p>
+    <w:p>
+      <w:pPr>
+        <w:pStyle w:val="Bibentry"/>
+      </w:pPr>
+      <w:r>
         <w:t>Wang, P., Wang, F., and Li, Z. 2023. Exploring the ecosystem of K-12 online learning: An empirical study of impact mechanisms in the post-pandemic era. Frontiers in Psychology 14, 1241477 (2023). DOI: 10.3389/fpsyg.2023.1241477.</w:t>
       </w:r>
     </w:p>
@@ -3094,142 +3206,6 @@
       </w:pPr>
       <w:r>
         <w:t>Yu, Z. 2021. The effects of gender, educational level, and personality on online learning outcomes during the COVID-19 pandemic. International Journal of Educational Technology in Higher Education 18, 1, Article 14 (2021). DOI: 10.1186/s41239-021-00252-3.</w:t>
-      </w:r>
-    </w:p>
-    <w:p>
-      <w:pPr>
-        <w:pStyle w:val="Bibentry"/>
-      </w:pPr>
-      <w:r>
-        <w:t>Chen, S., Cheung, A. C. K., and Zeng, Z. 2025. Big Five personality traits and university students' academic performance: A meta-analysis. Personality and Individual Differences 240, 113163 (2025). DOI: 10.1016/j.paid.2025.113163.</w:t>
-      </w:r>
-    </w:p>
-    <w:p>
-      <w:pPr>
-        <w:pStyle w:val="Bibentry"/>
-      </w:pPr>
-      <w:r>
-        <w:t>Mammadov, S. 2022. Big Five personality traits and academic performance: A meta-analysis. Journal of Personality 90, 2 (2022), 222–255. DOI: 10.1111/jopy.12663.</w:t>
-      </w:r>
-    </w:p>
-    <w:p>
-      <w:pPr>
-        <w:pStyle w:val="Bibentry"/>
-      </w:pPr>
-      <w:r>
-        <w:t>Poropat, A. E. 2009. A meta-analysis of the five-factor model of personality and academic performance. Psychological Bulletin 135, 2 (2009), 322–338. DOI: 10.1037/a0014996.</w:t>
-      </w:r>
-    </w:p>
-    <w:p>
-      <w:pPr>
-        <w:pStyle w:val="Bibentry"/>
-      </w:pPr>
-      <w:r>
-        <w:t>Hofstede, G. 1986. Cultural differences in teaching and learning. International Journal of Intercultural Relations 10, 3 (1986), 301–320. DOI: 10.1016/0147-1767(86)90015-5.</w:t>
-      </w:r>
-    </w:p>
-    <w:p>
-      <w:pPr>
-        <w:pStyle w:val="Bibentry"/>
-      </w:pPr>
-      <w:r>
-        <w:t>Hofstede, G. 2001. Culture's Consequences: Comparing Values, Behaviors, Institutions and Organizations across Nations (2nd. ed.). Sage Publications, Thousand Oaks, CA.</w:t>
-      </w:r>
-    </w:p>
-    <w:p>
-      <w:pPr>
-        <w:pStyle w:val="Bibentry"/>
-      </w:pPr>
-      <w:r>
-        <w:t>Hofstede, G. and McCrae, R. R. 2004. Personality and culture revisited: Linking traits and dimensions of culture. Cross-Cultural Research 38, 1 (2004), 52–88. DOI: 10.1177/1069397103259443.</w:t>
-      </w:r>
-    </w:p>
-    <w:p>
-      <w:pPr>
-        <w:pStyle w:val="Bibentry"/>
-      </w:pPr>
-      <w:r>
-        <w:t>Hofstede Insights. 2024. Country comparison tool. Retrieved 2024 from https://www.hofstede-insights.com/.</w:t>
-      </w:r>
-    </w:p>
-    <w:p>
-      <w:pPr>
-        <w:pStyle w:val="Bibentry"/>
-      </w:pPr>
-      <w:r>
-        <w:t>Allik, J. and McCrae, R. R. 2004. Toward a geography of personality traits: Patterns of profiles across 36 cultures. Journal of Cross-Cultural Psychology 35, 1 (2004), 13–28. DOI: 10.1177/0022022103260382.</w:t>
-      </w:r>
-    </w:p>
-    <w:p>
-      <w:pPr>
-        <w:pStyle w:val="Bibentry"/>
-      </w:pPr>
-      <w:r>
-        <w:t>McCrae, R. R. and Terracciano, A. 2005. Universal features of personality traits from the observer's perspective: Data from 50 cultures. Journal of Personality and Social Psychology 88, 3 (2005), 547–561. DOI: 10.1037/0022-3514.88.3.547.</w:t>
-      </w:r>
-    </w:p>
-    <w:p>
-      <w:pPr>
-        <w:pStyle w:val="Bibentry"/>
-      </w:pPr>
-      <w:r>
-        <w:t>Schmitt, D. P., Allik, J., McCrae, R. R., and Benet-Martínez, V. 2007. The geographic distribution of Big Five personality traits: Patterns and profiles of human self-description across 56 nations. Journal of Cross-Cultural Psychology 38, 2 (2007), 173–212. DOI: 10.1177/0022022106297299.</w:t>
-      </w:r>
-    </w:p>
-    <w:p>
-      <w:pPr>
-        <w:pStyle w:val="Bibentry"/>
-      </w:pPr>
-      <w:r>
-        <w:t>Migliore, L. A. 2011. Relation between big five personality traits and Hofstede's cultural dimensions: Samples from the USA and India. Cross Cultural Management: An International Journal 18, 1 (2011), 38–54. DOI: 10.1108/13527601111104287.</w:t>
-      </w:r>
-    </w:p>
-    <w:p>
-      <w:pPr>
-        <w:pStyle w:val="Bibentry"/>
-      </w:pPr>
-      <w:r>
-        <w:t>Cheung, F. M., Cheung, S. F., Wada, S., and Zhang, J. 2003. Indigenous measures of personality assessment in Asian countries: A review. Psychological Assessment 15, 3 (2003), 280–289. DOI: 10.1037/1040-3590.15.3.280.</w:t>
-      </w:r>
-    </w:p>
-    <w:p>
-      <w:pPr>
-        <w:pStyle w:val="Bibentry"/>
-      </w:pPr>
-      <w:r>
-        <w:t>Lynn, R. and Martin, T. 1995. National differences for thirty-seven nations in extraversion, neuroticism, psychoticism and economic, demographic and other correlates. Personality and Individual Differences 19, 3 (1995), 403–406. DOI: 10.1016/0191-8869(95)00054-A.</w:t>
-      </w:r>
-    </w:p>
-    <w:p>
-      <w:pPr>
-        <w:pStyle w:val="Bibentry"/>
-      </w:pPr>
-      <w:r>
-        <w:t>McSweeney, B. 2002. Hofstede's model of national cultural differences and their consequences: A triumph of faith — a failure of analysis. Human Relations 55, 1 (2002), 89–118. DOI: 10.1177/0018726702551004.</w:t>
-      </w:r>
-    </w:p>
-    <w:p>
-      <w:pPr>
-        <w:pStyle w:val="Bibentry"/>
-      </w:pPr>
-      <w:r>
-        <w:t>Minkov, M. and Hofstede, G. 2014. A replication of Hofstede's uncertainty avoidance dimension across nationally representative samples from Europe. International Journal of Cross-Cultural Management 14, 1 (2014), 7–22. DOI: 10.1177/1470595814521600.</w:t>
-      </w:r>
-    </w:p>
-    <w:p>
-      <w:pPr>
-        <w:pStyle w:val="Bibentry"/>
-      </w:pPr>
-      <w:r>
-        <w:t>Page, M. J., McKenzie, J. E., Bossuyt, P. M., Boutron, I., Hoffmann, T. C., Mulrow, C. D., Shamseer, L., Tetzlaff, J. M., Akl, E. A., Brennan, S. E., et al. 2021. The PRISMA 2020 statement: An updated guideline for reporting systematic reviews. BMJ 372, n71 (2021). DOI: 10.1136/bmj.n71.</w:t>
-      </w:r>
-    </w:p>
-    <w:p>
-      <w:pPr>
-        <w:pStyle w:val="Bibentry"/>
-      </w:pPr>
-      <w:r>
-        <w:t>Tokiwa, E. 2026. Big Five personality traits and academic achievement in online learning environments: A systematic review and meta-analysis. Research Square preprint (2026). DOI: 10.21203/rs.3.rs-9513298/v1.</w:t>
       </w:r>
     </w:p>
     <w:sectPr>

</xml_diff>

<commit_message>
ICEEL EL2036: verify every reference against its source
Checked all references for existence, DOI and bibliographic details:
14 against the DOIs and headers printed in the local PDFs, the rest by
web search (Crossref and doi.org are not reachable from this session).

- Minkov & Hofstede (2014) was IJCCM 14(2), 161-171, not 14(1), 7-22,
  and it replicates the uncertainty-avoidance dimension rather than
  critiquing the framework; cite it as such in Sections 2.1 and 6.
- Hofstede (2001) has five dimensions; Indulgence was added in Hofstede,
  Hofstede & Minkov (2010), now cited and listed.
- Sort references by full author list so single-author entries precede
  co-authored ones (ACM order).

Hofstede (1986)'s DOI could not be confirmed online; its volume,
issue and pages were confirmed. Still 9 pages.

Co-Authored-By: Claude Opus 5.5 <noreply@anthropic.com>
Claude-Session: https://claude.ai/code/session_01JF828uiGyeimQxSyCjdcgF
</commit_message>
<xml_diff>
--- a/metaanalysis/conference_submissions/iceel/camera_ready/EL2036_Tokiwa_final.docx
+++ b/metaanalysis/conference_submissions/iceel/camera_ready/EL2036_Tokiwa_final.docx
@@ -143,7 +143,7 @@
         <w:pStyle w:val="PostHeadPara"/>
       </w:pPr>
       <w:r>
-        <w:t>Hofstede's (2001) 2nd-edition model operationalises national culture in 6 dimensions — Power Distance (PDI), Individualism (IDV), Masculinity (MAS), Uncertainty Avoidance (UAI), Long-Term Orientation (LTO), Indulgence (IND); latest scores from Hofstede Insights (2024). Critiques (Minkov &amp; Hofstede, 2014; McSweeney, 2002) for ecological-fallacy risk and for the 1970s IBM-sample provenance are acknowledged: we use the dimensions as country-level proxies for shared cultural orientation, not as individual-level claims.</w:t>
+        <w:t>Hofstede's model operationalises national culture in five dimensions (Hofstede 2001), extended to six with Indulgence (Hofstede, Hofstede, &amp; Minkov 2010) — Power Distance (PDI), Individualism (IDV), Masculinity (MAS), Uncertainty Avoidance (UAI), Long-Term Orientation (LTO), Indulgence (IND); latest scores from Hofstede Insights (2024). Critiques of the framework for ecological-fallacy risk and for the 1970s IBM-sample provenance (McSweeney, 2002) are acknowledged, although the uncertainty-avoidance dimension has been replicated in nationally representative European samples (Minkov &amp; Hofstede, 2014). We use the dimensions as country-level proxies for shared cultural orientation, not as individual-level claims.</w:t>
       </w:r>
     </w:p>
     <w:p>
@@ -3013,7 +3013,7 @@
         <w:pStyle w:val="PostHeadPara"/>
       </w:pPr>
       <w:r>
-        <w:t>The dominant limitation is k. With k = 2 Asian primary-pool studies, the fits on Hofstede scores have zero residual degrees of freedom; they are two-country contrasts, and the correspondence in Table 4 is descriptive. Hofstede &amp; McCrae (2004) correlations describe country-level trait means, not within-country trait – outcome correlations, so Table 4 rests on a cross-level comparison and cannot test a mechanism. The two Japan studies also differ in outcome construct and effect-size metric (engagement ρ vs grade r) as well as in instrument. The Hofstede framework itself is critiqued (Minkov &amp; Hofstede, 2014; McSweeney, 2002) for ecological-fallacy risk and IBM-sample provenance; Minkov-revised dimensions might yield different reference directions. Western-derived Big Five may not capture culture-specific personality structure in Japan (Cheung et al., 2003). Single-author, single-coder; country-to-Hofstede-dimension assignment uses the canonical Hofstede Insights (2024) table rather than hand-coding.</w:t>
+        <w:t>The dominant limitation is k. With k = 2 Asian primary-pool studies, the fits on Hofstede scores have zero residual degrees of freedom; they are two-country contrasts, and the correspondence in Table 4 is descriptive. Hofstede &amp; McCrae (2004) correlations describe country-level trait means, not within-country trait – outcome correlations, so Table 4 rests on a cross-level comparison and cannot test a mechanism. The two Japan studies also differ in outcome construct and effect-size metric (engagement ρ vs grade r) as well as in instrument. The Hofstede framework itself is critiqued for ecological-fallacy risk and IBM-sample provenance (McSweeney, 2002); revised or replicated dimensions (e.g., Minkov &amp; Hofstede, 2014) might yield different reference directions. Western-derived Big Five may not capture culture-specific personality structure in Japan (Cheung et al., 2003). Single-author, single-coder; country-to-Hofstede-dimension assignment uses the canonical Hofstede Insights (2024) table rather than hand-coding.</w:t>
       </w:r>
     </w:p>
     <w:p>
@@ -3117,6 +3117,14 @@
         <w:pStyle w:val="Bibentry"/>
       </w:pPr>
       <w:r>
+        <w:t>Hofstede, G., Hofstede, G. J., and Minkov, M. 2010. Cultures and Organizations: Software of the Mind (3rd. ed.). McGraw-Hill, New York, NY.</w:t>
+      </w:r>
+    </w:p>
+    <w:p>
+      <w:pPr>
+        <w:pStyle w:val="Bibentry"/>
+      </w:pPr>
+      <w:r>
         <w:t>Hofstede, G. and McCrae, R. R. 2004. Personality and culture revisited: Linking traits and dimensions of culture. Cross-Cultural Research 38, 1 (2004), 52–88. DOI: 10.1177/1069397103259443.</w:t>
       </w:r>
     </w:p>
@@ -3141,7 +3149,7 @@
         <w:pStyle w:val="Bibentry"/>
       </w:pPr>
       <w:r>
-        <w:t>Minkov, M. and Hofstede, G. 2014. A replication of Hofstede's uncertainty avoidance dimension across nationally representative samples from Europe. International Journal of Cross-Cultural Management 14, 1 (2014), 7–22. DOI: 10.1177/1470595814521600.</w:t>
+        <w:t>Minkov, M. and Hofstede, G. 2014. A replication of Hofstede's uncertainty avoidance dimension across nationally representative samples from Europe. International Journal of Cross Cultural Management 14, 2 (2014), 161–171. DOI: 10.1177/1470595814521600.</w:t>
       </w:r>
     </w:p>
     <w:p>

</xml_diff>

<commit_message>
ICEEL EL2036: Hofstede スコアを The Culture Factor の現在値に更新
- run_hofstede_meta.py の国別スコアを 2026-10-27 取得値に更新
  (2023年10月改訂の IDV・LTO を反映: 日本 IDV 46→62, LTO 88→100;
  中国 IDV 20→43, LTO 87→77)。Table 2 の IDV・LTO 行のみ変化、符号は不変
- 2.1・3.2・4.2・5.2 と Table 2 の注を新しいスコア差に合わせて修正
- 参考文献 Hofstede Insights (2024) を The Culture Factor Group (2026) に
  差し替え (hofstede-insights.com はドメイン失効)
- Abstract の r = −0.095, F(1, 7) = 12.94 を本論文の再解析値として記述
- docx を再生成して camera_ready にコピー、response_to_reviewer.md に追記

Co-Authored-By: Claude Fable 5.1 <noreply@anthropic.com>
</commit_message>
<xml_diff>
--- a/metaanalysis/conference_submissions/iceel/camera_ready/EL2036_Tokiwa_final.docx
+++ b/metaanalysis/conference_submissions/iceel/camera_ready/EL2036_Tokiwa_final.docx
@@ -37,7 +37,7 @@
         <w:t xml:space="preserve">Background. </w:t>
       </w:r>
       <w:r>
-        <w:t xml:space="preserve">The parent meta-analysis (Research Square preprint, DOI 10.21203/rs.3.rs-9513298/v1) reports an Extraversion × Region moderator in Big Five – academic-achievement research on online learning (Asian pooled r = −0.095, k = 2, vs non-Asian r = +0.050, k = 7; Knapp–Hartung meta-regression F(1, 7) = 12.94, p = .009), but does not decompose the Asia bin into its country-level constituents. </w:t>
+        <w:t xml:space="preserve">The parent meta-analysis (Research Square preprint, DOI 10.21203/rs.3.rs-9513298/v1) reports an Extraversion × Region moderator in Big Five – academic-achievement research on online learning but does not decompose the Asia bin into its country-level constituents. Re-analysed here with a Knapp–Hartung meta-regression, the contrast is Asian pooled r = −0.095 (k = 2) vs non-Asian r = +0.050 (k = 7), F(1, 7) = 12.94, p = .009. </w:t>
       </w:r>
       <w:r>
         <w:rPr>
@@ -111,7 +111,7 @@
         <w:pStyle w:val="PostHeadPara"/>
       </w:pPr>
       <w:r>
-        <w:t>The Big Five – academic-achievement link is robust at the trait level (Poropat 2009; Mammadov 2022; Chen, Cheung, &amp; Zeng 2025) but is increasingly recognised as culturally conditional, with Mammadov (2022) reporting larger correlations in Asian samples than in other regions for every trait. The parent preprint (Tokiwa, 2026, DOI 10.21203/rs.3.rs-9513298/v1) reports a binary Asia / non-Asia contrast with Extraversion × Region the headline (Asian r = −0.131 vs non-Asian r = +0.050) but does not decompose the Asian bin into its country-level constituents — even though Japan, China, Korea, and Taiwan differ sharply on Hofstede Power Distance, UAI, MAS, and IND scores (Hofstede Insights 2024). Re-analysed here, with β converted to r by the published Peterson–Brown rule (the preprint pushed negative β a further .05 from zero) and the contrast tested with a Knapp–Hartung mixed-effects meta-regression (the preprint's Q_between = 46.43 applied a large-sample χ² test to small-sample HKSJ standard errors), the Asian estimate is r = −0.095 and the contrast F(1, 7) = 12.94, p = .009. Either way, the contrast rests on only two Asian studies.</w:t>
+        <w:t>The Big Five – academic-achievement link is robust at the trait level (Poropat 2009; Mammadov 2022; Chen, Cheung, &amp; Zeng 2025) but is increasingly recognised as culturally conditional, with Mammadov (2022) reporting larger correlations in Asian samples than in other regions for every trait. The parent preprint (Tokiwa, 2026, DOI 10.21203/rs.3.rs-9513298/v1) reports a binary Asia / non-Asia contrast with Extraversion × Region the headline (Asian r = −0.131 vs non-Asian r = +0.050) but does not decompose the Asian bin into its country-level constituents — even though Japan, China, Korea, and Taiwan differ sharply on Hofstede Power Distance, UAI, MAS, and IND scores (The Culture Factor Group 2026). Re-analysed here, with β converted to r by the published Peterson–Brown rule (the preprint pushed negative β a further .05 from zero) and the contrast tested with a Knapp–Hartung mixed-effects meta-regression (the preprint's Q_between = 46.43 applied a large-sample χ² test to small-sample HKSJ standard errors), the Asian estimate is r = −0.095 and the contrast F(1, 7) = 12.94, p = .009. Either way, the contrast rests on only two Asian studies.</w:t>
       </w:r>
     </w:p>
     <w:p>
@@ -143,7 +143,7 @@
         <w:pStyle w:val="PostHeadPara"/>
       </w:pPr>
       <w:r>
-        <w:t>Hofstede's model operationalises national culture in five dimensions (Hofstede 2001), extended to six with Indulgence (Hofstede, Hofstede, &amp; Minkov 2010) — Power Distance (PDI), Individualism (IDV), Masculinity (MAS), Uncertainty Avoidance (UAI), Long-Term Orientation (LTO), Indulgence (IND); latest scores from Hofstede Insights (2024). Critiques of the framework for ecological-fallacy risk and for the 1970s IBM-sample provenance (McSweeney, 2002) are acknowledged, although the uncertainty-avoidance dimension has been replicated in nationally representative European samples (Minkov &amp; Hofstede, 2014). We use the dimensions as country-level proxies for shared cultural orientation, not as individual-level claims.</w:t>
+        <w:t>Hofstede's model operationalises national culture in five dimensions (Hofstede 2001), extended to six with Indulgence (Hofstede, Hofstede, &amp; Minkov 2010) — Power Distance (PDI), Individualism (IDV), Masculinity (MAS), Uncertainty Avoidance (UAI), Long-Term Orientation (LTO), Indulgence (IND); country scores are taken from the current country comparison tool of The Culture Factor Group (2026; formerly Hofstede Insights), whose Individualism and Long-Term Orientation scores were revised in 2023. Critiques of the framework for ecological-fallacy risk and for the 1970s IBM-sample provenance (McSweeney, 2002) are acknowledged, although the uncertainty-avoidance dimension has been replicated in nationally representative European samples (Minkov &amp; Hofstede, 2014). We use the dimensions as country-level proxies for shared cultural orientation, not as individual-level claims.</w:t>
       </w:r>
     </w:p>
     <w:p>
@@ -159,7 +159,7 @@
         <w:pStyle w:val="Para"/>
       </w:pPr>
       <w:r>
-        <w:t>Japan's profile (PDI = 54, IDV = 46, MAS = 95, UAI = 92) implies, at the country level, the reference directions listed in Section 4.4 (Table 4). These are not predictions for individual learners: Hofstede &amp; McCrae (2004) correlate national culture scores with national trait means, and the same association need not hold for trait – outcome correlations within one country. We use them only as a reference point. The N reference is of particular interest because it runs opposite to the null-to-negative N pattern in earlier Big Five – achievement meta-analyses, including their Asian samples (Poropat, 2009; Mammadov, 2022).</w:t>
+        <w:t>Japan's profile (PDI = 54, IDV = 62, MAS = 95, UAI = 92) implies, at the country level, the reference directions listed in Section 4.4 (Table 4). These are not predictions for individual learners: Hofstede &amp; McCrae (2004) correlate national culture scores with national trait means, and the same association need not hold for trait – outcome correlations within one country. We use them only as a reference point. The N reference is of particular interest because it runs opposite to the null-to-negative N pattern in earlier Big Five – achievement meta-analyses, including their Asian samples (Poropat, 2009; Mammadov, 2022).</w:t>
       </w:r>
     </w:p>
     <w:p>
@@ -275,7 +275,7 @@
         <w:pStyle w:val="PostHeadPara"/>
       </w:pPr>
       <w:r>
-        <w:t>Country-level Hofstede 6-D scores are encoded inline in the analysis script using the canonical Hofstede Insights values. For the Asian primary-pool countries:</w:t>
+        <w:t>Country-level Hofstede 6-D scores are encoded inline in the analysis script using the scores published by The Culture Factor Group (2026; formerly Hofstede Insights), retrieved 27 October 2026, which include the 2023 revision of the Individualism and Long-Term Orientation scores. For the Asian primary-pool countries:</w:t>
       </w:r>
     </w:p>
     <w:p>
@@ -283,7 +283,7 @@
         <w:pStyle w:val="Para"/>
       </w:pPr>
       <w:r>
-        <w:t>Japan: PDI = 54, IDV = 46, MAS = 95, UAI = 92, LTO = 88, IND = 42. China: PDI = 80, IDV = 20, MAS = 66, UAI = 30, LTO = 87, IND = 24.</w:t>
+        <w:t>Japan: PDI = 54, IDV = 62, MAS = 95, UAI = 92, LTO = 100, IND = 42. China: PDI = 80, IDV = 43, MAS = 66, UAI = 30, LTO = 77, IND = 24.</w:t>
       </w:r>
     </w:p>
     <w:p>
@@ -291,7 +291,7 @@
         <w:pStyle w:val="Para"/>
       </w:pPr>
       <w:r>
-        <w:t>These two countries differ most sharply on Individualism (Japan +26), Power Distance (China +26), Masculinity (Japan +29), Uncertainty Avoidance (Japan +62), and Indulgence (Japan +18), with similar Long-Term Orientation.</w:t>
+        <w:t>These two countries differ most sharply on Uncertainty Avoidance (Japan +62), Masculinity (Japan +29), Power Distance (China +26), Long-Term Orientation (Japan +23), Individualism (Japan +19), and Indulgence (Japan +18).</w:t>
       </w:r>
     </w:p>
     <w:p>
@@ -1028,7 +1028,7 @@
               <w:rPr>
                 <w:sz w:val="16"/>
               </w:rPr>
-              <w:t>−0.0165</w:t>
+              <w:t>−0.0226</w:t>
             </w:r>
           </w:p>
         </w:tc>
@@ -1086,7 +1086,7 @@
               <w:rPr>
                 <w:sz w:val="16"/>
               </w:rPr>
-              <w:t>−0.4303</w:t>
+              <w:t>−0.0187</w:t>
             </w:r>
           </w:p>
         </w:tc>
@@ -1202,7 +1202,7 @@
               <w:rPr>
                 <w:sz w:val="16"/>
               </w:rPr>
-              <w:t>+0.0015</w:t>
+              <w:t>+0.0020</w:t>
             </w:r>
           </w:p>
         </w:tc>
@@ -1260,7 +1260,7 @@
               <w:rPr>
                 <w:sz w:val="16"/>
               </w:rPr>
-              <w:t>+0.0387</w:t>
+              <w:t>+0.0017</w:t>
             </w:r>
           </w:p>
         </w:tc>
@@ -1376,7 +1376,7 @@
               <w:rPr>
                 <w:sz w:val="16"/>
               </w:rPr>
-              <w:t>−0.0039</w:t>
+              <w:t>−0.0053</w:t>
             </w:r>
           </w:p>
         </w:tc>
@@ -1434,7 +1434,7 @@
               <w:rPr>
                 <w:sz w:val="16"/>
               </w:rPr>
-              <w:t>−0.1001</w:t>
+              <w:t>−0.0044</w:t>
             </w:r>
           </w:p>
         </w:tc>
@@ -1550,7 +1550,7 @@
               <w:rPr>
                 <w:sz w:val="16"/>
               </w:rPr>
-              <w:t>−0.4085</w:t>
+              <w:t>−0.0178</w:t>
             </w:r>
           </w:p>
         </w:tc>
@@ -1666,7 +1666,7 @@
               <w:rPr>
                 <w:sz w:val="16"/>
               </w:rPr>
-              <w:t>+0.0008</w:t>
+              <w:t>+0.0011</w:t>
             </w:r>
           </w:p>
         </w:tc>
@@ -1724,7 +1724,7 @@
               <w:rPr>
                 <w:sz w:val="16"/>
               </w:rPr>
-              <w:t>+0.0209</w:t>
+              <w:t>+0.0009</w:t>
             </w:r>
           </w:p>
         </w:tc>
@@ -1749,7 +1749,7 @@
         <w:pStyle w:val="Para"/>
       </w:pPr>
       <w:r>
-        <w:t>(Selected rows; full table in results/hofstede_meta_regression.csv. With k = 2, all six dimensions re-express the same single Japan – China contrast. PDI and IDV slopes are mirror images because the two countries differ by 26 points on each, in opposite directions; LTO slopes are the largest in magnitude only because the two LTO scores differ by a single point (88 vs 87), and they carry no information.)</w:t>
+        <w:t>(Selected rows; full table in results/hofstede_meta_regression.csv. With k = 2, all six dimensions re-express the same single Japan – China contrast: each slope is the Japan – China difference in Fisher z divided by the difference in country scores, so the slopes differ across dimensions only through the size and sign of that score difference (Japan minus China: PDI −26, IDV +19, MAS +29, UAI +62, LTO +23, IND +18).)</w:t>
       </w:r>
     </w:p>
     <w:p>
@@ -1757,7 +1757,7 @@
         <w:pStyle w:val="Para"/>
       </w:pPr>
       <w:r>
-        <w:t>The Extraversion slope on Individualism is negative (−0.0039): Japan, the more individualistic of the two countries (IDV 46 vs 20), shows the more negative Extraversion – achievement correlation (−0.173 vs −0.074). This runs against the expectation that Extraversion is more of an asset in individualistic contexts. With df_resid = 0 these slopes carry no inferential weight; they are re-expressions of the two-country contrast, not statistical tests.</w:t>
+        <w:t>The Extraversion slope on Individualism is negative (−0.0053): Japan, the more individualistic of the two countries (IDV 62 vs 43), shows the more negative Extraversion – achievement correlation (−0.173 vs −0.074). This runs against the expectation that Extraversion is more of an asset in individualistic contexts. With df_resid = 0 these slopes carry no inferential weight; they are re-expressions of the two-country contrast, not statistical tests.</w:t>
       </w:r>
     </w:p>
     <w:p>
@@ -2949,7 +2949,7 @@
         <w:pStyle w:val="PostHeadPara"/>
       </w:pPr>
       <w:r>
-        <w:t>With k = 2, the slopes in Table 2 can only be read as the direction of a single Japan – China contrast, and that contrast is confounded with everything else that differs between the two studies (instrument, education level, outcome measure, β-converted vs direct r). Read this way, the Extraversion slope on Individualism runs against the theoretical expectation: the more individualistic country shows the more negative Extraversion correlation. The LTO slopes cannot be interpreted at all, because the two countries' LTO scores differ by only one point.</w:t>
+        <w:t>With k = 2, the slopes in Table 2 can only be read as the direction of a single Japan – China contrast, and that contrast is confounded with everything else that differs between the two studies (instrument, education level, outcome measure, β-converted vs direct r). Read this way, the Extraversion slope on Individualism runs against the theoretical expectation: the more individualistic country shows the more negative Extraversion correlation. The other dimensions add nothing: with two countries, every slope re-expresses the same contrast through a different score difference.</w:t>
       </w:r>
     </w:p>
     <w:p>
@@ -3013,7 +3013,7 @@
         <w:pStyle w:val="PostHeadPara"/>
       </w:pPr>
       <w:r>
-        <w:t>The dominant limitation is k. With k = 2 Asian primary-pool studies, the fits on Hofstede scores have zero residual degrees of freedom; they are two-country contrasts, and the correspondence in Table 4 is descriptive. Hofstede &amp; McCrae (2004) correlations describe country-level trait means, not within-country trait – outcome correlations, so Table 4 rests on a cross-level comparison and cannot test a mechanism. The two Japan studies also differ in outcome construct and effect-size metric (engagement ρ vs grade r) as well as in instrument. The Hofstede framework itself is critiqued for ecological-fallacy risk and IBM-sample provenance (McSweeney, 2002); revised or replicated dimensions (e.g., Minkov &amp; Hofstede, 2014) might yield different reference directions. Western-derived Big Five may not capture culture-specific personality structure in Japan (Cheung et al., 2003). Single-author, single-coder; country-to-Hofstede-dimension assignment uses the canonical Hofstede Insights (2024) table rather than hand-coding.</w:t>
+        <w:t>The dominant limitation is k. With k = 2 Asian primary-pool studies, the fits on Hofstede scores have zero residual degrees of freedom; they are two-country contrasts, and the correspondence in Table 4 is descriptive. Hofstede &amp; McCrae (2004) correlations describe country-level trait means, not within-country trait – outcome correlations, so Table 4 rests on a cross-level comparison and cannot test a mechanism. The two Japan studies also differ in outcome construct and effect-size metric (engagement ρ vs grade r) as well as in instrument. The Hofstede framework itself is critiqued for ecological-fallacy risk and IBM-sample provenance (McSweeney, 2002); revised or replicated dimensions (e.g., Minkov &amp; Hofstede, 2014) might yield different reference directions. Western-derived Big Five may not capture culture-specific personality structure in Japan (Cheung et al., 2003). Single-author, single-coder; country-to-Hofstede-dimension assignment uses the published country comparison table of The Culture Factor Group (2026) rather than hand-coding.</w:t>
       </w:r>
     </w:p>
     <w:p>
@@ -3093,7 +3093,7 @@
         <w:pStyle w:val="Bibentry"/>
       </w:pPr>
       <w:r>
-        <w:t>Hofstede Insights. 2024. Country comparison tool. Retrieved 2024 from https://www.hofstede-insights.com/.</w:t>
+        <w:t>Hofstede, G. 1986. Cultural differences in teaching and learning. International Journal of Intercultural Relations 10, 3 (1986), 301–320. DOI: 10.1016/0147-1767(86)90015-5.</w:t>
       </w:r>
     </w:p>
     <w:p>
@@ -3101,7 +3101,7 @@
         <w:pStyle w:val="Bibentry"/>
       </w:pPr>
       <w:r>
-        <w:t>Hofstede, G. 1986. Cultural differences in teaching and learning. International Journal of Intercultural Relations 10, 3 (1986), 301–320. DOI: 10.1016/0147-1767(86)90015-5.</w:t>
+        <w:t>Hofstede, G. 2001. Culture's Consequences: Comparing Values, Behaviors, Institutions and Organizations across Nations (2nd. ed.). Sage Publications, Thousand Oaks, CA.</w:t>
       </w:r>
     </w:p>
     <w:p>
@@ -3109,7 +3109,7 @@
         <w:pStyle w:val="Bibentry"/>
       </w:pPr>
       <w:r>
-        <w:t>Hofstede, G. 2001. Culture's Consequences: Comparing Values, Behaviors, Institutions and Organizations across Nations (2nd. ed.). Sage Publications, Thousand Oaks, CA.</w:t>
+        <w:t>Hofstede, G., Hofstede, G. J., and Minkov, M. 2010. Cultures and Organizations: Software of the Mind (3rd. ed.). McGraw-Hill, New York, NY.</w:t>
       </w:r>
     </w:p>
     <w:p>
@@ -3117,7 +3117,7 @@
         <w:pStyle w:val="Bibentry"/>
       </w:pPr>
       <w:r>
-        <w:t>Hofstede, G., Hofstede, G. J., and Minkov, M. 2010. Cultures and Organizations: Software of the Mind (3rd. ed.). McGraw-Hill, New York, NY.</w:t>
+        <w:t>Hofstede, G. and McCrae, R. R. 2004. Personality and culture revisited: Linking traits and dimensions of culture. Cross-Cultural Research 38, 1 (2004), 52–88. DOI: 10.1177/1069397103259443.</w:t>
       </w:r>
     </w:p>
     <w:p>
@@ -3125,7 +3125,7 @@
         <w:pStyle w:val="Bibentry"/>
       </w:pPr>
       <w:r>
-        <w:t>Hofstede, G. and McCrae, R. R. 2004. Personality and culture revisited: Linking traits and dimensions of culture. Cross-Cultural Research 38, 1 (2004), 52–88. DOI: 10.1177/1069397103259443.</w:t>
+        <w:t>Mammadov, S. 2022. Big Five personality traits and academic performance: A meta-analysis. Journal of Personality 90, 2 (2022), 222–255. DOI: 10.1111/jopy.12663.</w:t>
       </w:r>
     </w:p>
     <w:p>
@@ -3133,7 +3133,7 @@
         <w:pStyle w:val="Bibentry"/>
       </w:pPr>
       <w:r>
-        <w:t>Mammadov, S. 2022. Big Five personality traits and academic performance: A meta-analysis. Journal of Personality 90, 2 (2022), 222–255. DOI: 10.1111/jopy.12663.</w:t>
+        <w:t>McSweeney, B. 2002. Hofstede's model of national cultural differences and their consequences: A triumph of faith — a failure of analysis. Human Relations 55, 1 (2002), 89–118. DOI: 10.1177/0018726702551004.</w:t>
       </w:r>
     </w:p>
     <w:p>
@@ -3141,7 +3141,7 @@
         <w:pStyle w:val="Bibentry"/>
       </w:pPr>
       <w:r>
-        <w:t>McSweeney, B. 2002. Hofstede's model of national cultural differences and their consequences: A triumph of faith — a failure of analysis. Human Relations 55, 1 (2002), 89–118. DOI: 10.1177/0018726702551004.</w:t>
+        <w:t>Minkov, M. and Hofstede, G. 2014. A replication of Hofstede's uncertainty avoidance dimension across nationally representative samples from Europe. International Journal of Cross Cultural Management 14, 2 (2014), 161–171. DOI: 10.1177/1470595814521600.</w:t>
       </w:r>
     </w:p>
     <w:p>
@@ -3149,7 +3149,7 @@
         <w:pStyle w:val="Bibentry"/>
       </w:pPr>
       <w:r>
-        <w:t>Minkov, M. and Hofstede, G. 2014. A replication of Hofstede's uncertainty avoidance dimension across nationally representative samples from Europe. International Journal of Cross Cultural Management 14, 2 (2014), 161–171. DOI: 10.1177/1470595814521600.</w:t>
+        <w:t>Page, M. J., McKenzie, J. E., Bossuyt, P. M., Boutron, I., Hoffmann, T. C., Mulrow, C. D., Shamseer, L., Tetzlaff, J. M., Akl, E. A., Brennan, S. E., et al. 2021. The PRISMA 2020 statement: An updated guideline for reporting systematic reviews. BMJ 372, n71 (2021). DOI: 10.1136/bmj.n71.</w:t>
       </w:r>
     </w:p>
     <w:p>
@@ -3157,7 +3157,7 @@
         <w:pStyle w:val="Bibentry"/>
       </w:pPr>
       <w:r>
-        <w:t>Page, M. J., McKenzie, J. E., Bossuyt, P. M., Boutron, I., Hoffmann, T. C., Mulrow, C. D., Shamseer, L., Tetzlaff, J. M., Akl, E. A., Brennan, S. E., et al. 2021. The PRISMA 2020 statement: An updated guideline for reporting systematic reviews. BMJ 372, n71 (2021). DOI: 10.1136/bmj.n71.</w:t>
+        <w:t>Poropat, A. E. 2009. A meta-analysis of the five-factor model of personality and academic performance. Psychological Bulletin 135, 2 (2009), 322–338. DOI: 10.1037/a0014996.</w:t>
       </w:r>
     </w:p>
     <w:p>
@@ -3165,7 +3165,7 @@
         <w:pStyle w:val="Bibentry"/>
       </w:pPr>
       <w:r>
-        <w:t>Poropat, A. E. 2009. A meta-analysis of the five-factor model of personality and academic performance. Psychological Bulletin 135, 2 (2009), 322–338. DOI: 10.1037/a0014996.</w:t>
+        <w:t>Rivers, D. J. 2021. The role of personality traits and online academic self-efficacy in acceptance, actual use and achievement in Moodle. Education and Information Technologies 26, 4 (2021), 4353–4378. DOI: 10.1007/s10639-021-10478-3.</w:t>
       </w:r>
     </w:p>
     <w:p>
@@ -3173,7 +3173,7 @@
         <w:pStyle w:val="Bibentry"/>
       </w:pPr>
       <w:r>
-        <w:t>Rivers, D. J. 2021. The role of personality traits and online academic self-efficacy in acceptance, actual use and achievement in Moodle. Education and Information Technologies 26, 4 (2021), 4353–4378. DOI: 10.1007/s10639-021-10478-3.</w:t>
+        <w:t>Schmitt, D. P., Allik, J., McCrae, R. R., and Benet-Martínez, V. 2007. The geographic distribution of Big Five personality traits: Patterns and profiles of human self-description across 56 nations. Journal of Cross-Cultural Psychology 38, 2 (2007), 173–212. DOI: 10.1177/0022022106297299.</w:t>
       </w:r>
     </w:p>
     <w:p>
@@ -3181,7 +3181,7 @@
         <w:pStyle w:val="Bibentry"/>
       </w:pPr>
       <w:r>
-        <w:t>Schmitt, D. P., Allik, J., McCrae, R. R., and Benet-Martínez, V. 2007. The geographic distribution of Big Five personality traits: Patterns and profiles of human self-description across 56 nations. Journal of Cross-Cultural Psychology 38, 2 (2007), 173–212. DOI: 10.1177/0022022106297299.</w:t>
+        <w:t>The Culture Factor Group. 2026. Country comparison tool. Retrieved October 27, 2026 from https://www.theculturefactor.com/country-comparison-tool.</w:t>
       </w:r>
     </w:p>
     <w:p>

</xml_diff>